<commit_message>
Add execution-bound semantic invariance proof
</commit_message>
<xml_diff>
--- a/docs/SODIF_Product_Presentation.docx
+++ b/docs/SODIF_Product_Presentation.docx
@@ -431,7 +431,7 @@
                 <w:rFonts w:eastAsia="Calibri"/>
                 <w:sz w:val="18"/>
               </w:rPr>
-              <w:t>Produs 0.20.0 · validare de laborator TRL 4 · actualizat 13.09.2026</w:t>
+              <w:t>Produs 0.21.0 · validare de laborator TRL 4 · actualizat 16.09.2026</w:t>
             </w:r>
           </w:p>
         </w:tc>
@@ -756,7 +756,7 @@
                 <w:rFonts w:eastAsia="Calibri"/>
                 <w:sz w:val="17"/>
               </w:rPr>
-              <w:t>Compară reprezentări independente ale câmpurilor critice</w:t>
+              <w:t>Confruntă structura PDF cu forma vizibilă și fixează proveniența pe câmp</w:t>
             </w:r>
           </w:p>
         </w:tc>
@@ -1150,7 +1150,7 @@
                 <w:color w:val="FFFFFF"/>
                 <w:sz w:val="21"/>
               </w:rPr>
-              <w:t>Consens între reprezentări independente asupra câmpurilor critice, urmat de un permis unic legat criptografic de cererea API efectiv executată.</w:t>
+              <w:t>Invariabilitate semantică pe câmp între structura PDF și forma vizibilă, transformată într-o dovadă criptografică verificată odată cu cererea API.</w:t>
             </w:r>
           </w:p>
         </w:tc>
@@ -2411,7 +2411,7 @@
                 <w:rFonts w:eastAsia="Calibri"/>
                 <w:sz w:val="16"/>
               </w:rPr>
-              <w:t>Validează documentul, consensul și acțiunea</w:t>
+              <w:t>Validează documentul, dovada pe câmp și acțiunea</w:t>
             </w:r>
           </w:p>
         </w:tc>
@@ -2441,7 +2441,7 @@
                 <w:rFonts w:eastAsia="Calibri"/>
                 <w:sz w:val="16"/>
               </w:rPr>
-              <w:t>Decizie + permis unic</w:t>
+              <w:t>Dovadă semantică + permis unic</w:t>
             </w:r>
           </w:p>
         </w:tc>
@@ -3032,7 +3032,7 @@
                 <w:rFonts w:eastAsia="Calibri"/>
                 <w:sz w:val="16"/>
               </w:rPr>
-              <w:t>Revizii, risc, consens, plan, permis, Gateway</w:t>
+              <w:t>Revizii, provocare, invariabilitate, plan, permis, Gateway</w:t>
             </w:r>
           </w:p>
         </w:tc>
@@ -3220,7 +3220,7 @@
                 <w:rFonts w:eastAsia="Calibri"/>
                 <w:sz w:val="16"/>
               </w:rPr>
-              <w:t>Semnătură, semantică, API, stocare, observabilitate</w:t>
+              <w:t>Semnătură, PDF/OCR, API, stocare, observabilitate</w:t>
             </w:r>
           </w:p>
         </w:tc>
@@ -3506,7 +3506,7 @@
                 <w:rFonts w:eastAsia="Calibri"/>
                 <w:sz w:val="16"/>
               </w:rPr>
-              <w:t>Intenție canonică</w:t>
+              <w:t>Extragere independentă</w:t>
             </w:r>
           </w:p>
         </w:tc>
@@ -3536,7 +3536,7 @@
                 <w:rFonts w:eastAsia="Calibri"/>
                 <w:sz w:val="16"/>
               </w:rPr>
-              <w:t>Consens și risc</w:t>
+              <w:t>Dovadă pe câmp</w:t>
             </w:r>
           </w:p>
         </w:tc>
@@ -3566,7 +3566,7 @@
                 <w:rFonts w:eastAsia="Calibri"/>
                 <w:sz w:val="16"/>
               </w:rPr>
-              <w:t>Permis criptografic</w:t>
+              <w:t>Permis legat de acțiune</w:t>
             </w:r>
           </w:p>
         </w:tc>
@@ -4243,7 +4243,7 @@
                 <w:rFonts w:eastAsia="Calibri"/>
                 <w:sz w:val="15"/>
               </w:rPr>
-              <w:t>Document, consens, acțiune, politică, expirare, semnătură</w:t>
+              <w:t>Document, dovadă, rădăcină câmpuri, acțiune, politică, expirare, semnătură</w:t>
             </w:r>
           </w:p>
         </w:tc>
@@ -4273,7 +4273,7 @@
                 <w:rFonts w:eastAsia="Calibri"/>
                 <w:sz w:val="15"/>
               </w:rPr>
-              <w:t>sodif.execution-permit/v1</w:t>
+              <w:t>sodif.execution-permit/v2</w:t>
             </w:r>
           </w:p>
         </w:tc>
@@ -4307,7 +4307,7 @@
                 <w:b/>
                 <w:sz w:val="15"/>
               </w:rPr>
-              <w:t>GatewayRequest / Decision</w:t>
+              <w:t>GatewayRequest / GatewayDecision</w:t>
             </w:r>
           </w:p>
         </w:tc>
@@ -4337,7 +4337,7 @@
                 <w:rFonts w:eastAsia="Calibri"/>
                 <w:sz w:val="15"/>
               </w:rPr>
-              <w:t>Request, rută, permis, checks, digests, receipt</w:t>
+              <w:t>Request, rută, dovadă, permis, checks, digests, receipt</w:t>
             </w:r>
           </w:p>
         </w:tc>
@@ -4367,7 +4367,7 @@
                 <w:rFonts w:eastAsia="Calibri"/>
                 <w:sz w:val="15"/>
               </w:rPr>
-              <w:t>sodif.gateway-request/v1 / decision/v1</w:t>
+              <w:t>sodif.gateway-request/v2 / decision/v1</w:t>
             </w:r>
           </w:p>
         </w:tc>
@@ -5101,7 +5101,7 @@
                 <w:rFonts w:eastAsia="Calibri"/>
                 <w:sz w:val="16"/>
               </w:rPr>
-              <w:t>Rulează minimum două reprezentări independente</w:t>
+              <w:t>Rulează pypdf și o randare OCR selectată după semnătură</w:t>
             </w:r>
           </w:p>
         </w:tc>
@@ -5131,7 +5131,7 @@
                 <w:rFonts w:eastAsia="Calibri"/>
                 <w:sz w:val="16"/>
               </w:rPr>
-              <w:t>Valori tipizate + proveniență</w:t>
+              <w:t>Valori tipizate + locator + digest de proveniență</w:t>
             </w:r>
           </w:p>
         </w:tc>
@@ -5383,7 +5383,7 @@
                 <w:rFonts w:eastAsia="Calibri"/>
                 <w:sz w:val="16"/>
               </w:rPr>
-              <w:t>Asamblează exclusiv valorile confirmate</w:t>
+              <w:t>Asamblează exclusiv valorile stabile și angajamentele lor</w:t>
             </w:r>
           </w:p>
         </w:tc>
@@ -5413,7 +5413,7 @@
                 <w:rFonts w:eastAsia="Calibri"/>
                 <w:sz w:val="16"/>
               </w:rPr>
-              <w:t>Intenție operațională</w:t>
+              <w:t>Intenție + rădăcină Merkle</w:t>
             </w:r>
           </w:p>
         </w:tc>
@@ -5571,7 +5571,7 @@
                 <w:rFonts w:eastAsia="Calibri"/>
                 <w:sz w:val="16"/>
               </w:rPr>
-              <w:t>Semnează digesturile și fereastra de valabilitate</w:t>
+              <w:t>Semnează dovada, acțiunea și fereastra de valabilitate</w:t>
             </w:r>
           </w:p>
         </w:tc>
@@ -6022,7 +6022,7 @@
                 <w:rFonts w:eastAsia="Calibri"/>
                 <w:sz w:val="16"/>
               </w:rPr>
-              <w:t>Două vederi independente</w:t>
+              <w:t>pypdf + prima randare Tesseract</w:t>
             </w:r>
           </w:p>
         </w:tc>
@@ -6146,7 +6146,7 @@
                 <w:rFonts w:eastAsia="Calibri"/>
                 <w:sz w:val="16"/>
               </w:rPr>
-              <w:t>A treia vedere orientată spre API</w:t>
+              <w:t>A doua randare Tesseract cu profil independent</w:t>
             </w:r>
           </w:p>
         </w:tc>
@@ -6323,7 +6323,7 @@
           <w:rFonts w:eastAsia="Calibri"/>
           <w:sz w:val="21"/>
         </w:rPr>
-        <w:t>Fiecare adaptor declară un cost; rezultatul reține costul executat, costul disponibil și economia realizată.</w:t>
+        <w:t>Fiecare cale declară un cost; rezultatul reține procesarea executată, capacitatea disponibilă și economia realizată.</w:t>
       </w:r>
     </w:p>
     <w:p ns2:paraId="5F1A6E3F" ns2:textId="77777777">
@@ -6335,7 +6335,7 @@
           <w:rFonts w:eastAsia="Calibri"/>
           <w:sz w:val="21"/>
         </w:rPr>
-        <w:t>Fluxul conform V1 utilizează două vederi, 4 din 6 unități de cost și evită a treia cale.</w:t>
+        <w:t>Fluxul conform V1 utilizează pypdf și prima randare OCR, 4 din 7 unități de cost, și evită al doilea profil vizual.</w:t>
       </w:r>
     </w:p>
     <w:p ns2:paraId="14045C9A" ns2:textId="77777777">
@@ -6375,7 +6375,7 @@
         <w:rPr>
           <w:rFonts w:eastAsia="Calibri"/>
         </w:rPr>
-        <w:t>Un extractor AI/OCR poate clasifica, extrage, estima incertitudinea și explica diferențele prin același contract SemanticView. El rămâne o sursă de dovadă; consensul, politica și emiterea permisului sunt deterministe.</w:t>
+        <w:t>Tesseract OCR este executat local pe randări MuPDF și Poppler. Un extractor AI suplimentar poate folosi același contract SemanticView; autorizarea rămâne deterministă și dependentă de dovezi independente.</w:t>
       </w:r>
     </w:p>
     <w:p ns2:paraId="33D0F1D1" ns2:textId="77777777">
@@ -6400,8 +6400,7 @@
           <w:color w:val="0E8F95"/>
           <w:sz w:val="17"/>
         </w:rPr>
-        <w:lastRenderedPageBreak/>
-        <w:t>CROSS-VIEW EXECUTION INTEGRITY</w:t>
+        <w:t>EXECUTION BOUND SEMANTIC INVARIANCE</w:t>
       </w:r>
     </w:p>
     <w:p ns2:paraId="479DB3DE" ns2:textId="77777777">
@@ -6409,7 +6408,7 @@
         <w:pStyle w:val="Heading1"/>
       </w:pPr>
       <w:r>
-        <w:t>Consensul este calculat pe câmpurile care modifică efectul</w:t>
+        <w:t>Dovada urmărește invariabilitatea fiecărui câmp până la execuția API</w:t>
       </w:r>
     </w:p>
     <w:tbl>
@@ -6587,7 +6586,7 @@
                 <w:rFonts w:eastAsia="Calibri"/>
                 <w:sz w:val="17"/>
               </w:rPr>
-              <w:t>Obiecte și structură nativă a documentului</w:t>
+              <w:t>Text și obiecte interne citite cu pypdf</w:t>
             </w:r>
           </w:p>
         </w:tc>
@@ -6681,7 +6680,7 @@
                 <w:rFonts w:eastAsia="Calibri"/>
                 <w:sz w:val="17"/>
               </w:rPr>
-              <w:t>Conținut randat și relații de pagină</w:t>
+              <w:t>Pagină randată cu MuPDF la 300 DPI și citită cu Tesseract PSM 6</w:t>
             </w:r>
           </w:p>
         </w:tc>
@@ -6745,7 +6744,7 @@
                 <w:b/>
                 <w:sz w:val="17"/>
               </w:rPr>
-              <w:t>Orientată spre țintă</w:t>
+              <w:t>Vizuală secundară</w:t>
             </w:r>
           </w:p>
         </w:tc>
@@ -6775,7 +6774,7 @@
                 <w:rFonts w:eastAsia="Calibri"/>
                 <w:sz w:val="17"/>
               </w:rPr>
-              <w:t>Schema și parserul aplicației destinație</w:t>
+              <w:t>Randare Poppler la 360 DPI și Tesseract PSM 11</w:t>
             </w:r>
           </w:p>
         </w:tc>
@@ -6805,7 +6804,7 @@
                 <w:rFonts w:eastAsia="Calibri"/>
                 <w:sz w:val="17"/>
               </w:rPr>
-              <w:t>Confirmă forma folosită de API</w:t>
+              <w:t>Confirmă independent forma vizibilă utilizatorului</w:t>
             </w:r>
           </w:p>
         </w:tc>
@@ -6840,7 +6839,7 @@
           <w:rFonts w:eastAsia="Calibri"/>
           <w:sz w:val="21"/>
         </w:rPr>
-        <w:t>Autorizarea cere adaptoare și tipuri de vedere independente.</w:t>
+        <w:t>Câmpurile critice cer simultan proveniență structurală și proveniență vizuală.</w:t>
       </w:r>
     </w:p>
     <w:p ns2:paraId="55FD4D74" ns2:textId="77777777">
@@ -6864,7 +6863,7 @@
           <w:rFonts w:eastAsia="Calibri"/>
           <w:sz w:val="21"/>
         </w:rPr>
-        <w:t>Fiecare candidat păstrează adaptorul, încrederea, locatorul și digestul provenienței.</w:t>
+        <w:t>Fiecare candidat păstrează adaptorul, profilul, încrederea, pagina, coordonatele și digestul provenienței.</w:t>
       </w:r>
     </w:p>
     <w:p ns2:paraId="6E1CCB26" ns2:textId="77777777">
@@ -6936,7 +6935,7 @@
                 <w:color w:val="FFFFFF"/>
                 <w:sz w:val="21"/>
               </w:rPr>
-              <w:t>O aprobare formală devine executabilă numai după ce sensul folosit de sistemul țintă este concordant cu revizia semnată.</w:t>
+              <w:t>Valorile aprobate devin executabile după ce structura PDF și forma vizibilă concordă, iar fiecare parametru API este legat de angajamentul câmpului său.</w:t>
             </w:r>
           </w:p>
         </w:tc>
@@ -7245,7 +7244,7 @@
                 <w:rFonts w:eastAsia="Calibri"/>
                 <w:sz w:val="17"/>
               </w:rPr>
-              <w:t>verification_digest și consensus_digest</w:t>
+              <w:t>verification_digest, consensus_digest și execution_proof_digest</w:t>
             </w:r>
           </w:p>
         </w:tc>
@@ -7309,7 +7308,7 @@
                 <w:rFonts w:eastAsia="Calibri"/>
                 <w:sz w:val="17"/>
               </w:rPr>
-              <w:t>intent_digest și policy_digest</w:t>
+              <w:t>intent_digest, policy_digest și challenge_digest</w:t>
             </w:r>
           </w:p>
         </w:tc>
@@ -7373,7 +7372,7 @@
                 <w:rFonts w:eastAsia="Calibri"/>
                 <w:sz w:val="17"/>
               </w:rPr>
-              <w:t>action_digest pentru metodă, cale, audiență și parametri</w:t>
+              <w:t>action_digest, field_root și binding_root pentru acoperirea integrală a parametrilor</w:t>
             </w:r>
           </w:p>
         </w:tc>
@@ -7472,7 +7471,7 @@
           <w:rFonts w:eastAsia="Calibri"/>
           <w:sz w:val="21"/>
         </w:rPr>
-        <w:t>Documentul, revizia, manifestul, politica și planul trebuie să fie intern coerente.</w:t>
+        <w:t>Documentul, revizia, provocarea, rădăcina câmpurilor, manifestul, politica și planul trebuie să fie intern coerente.</w:t>
       </w:r>
     </w:p>
     <w:p ns2:paraId="6F3013FE" ns2:textId="77777777">
@@ -7504,7 +7503,7 @@
           <w:rFonts w:eastAsia="Calibri"/>
           <w:sz w:val="21"/>
         </w:rPr>
-        <w:t>Verificatorul controlează cheia de încredere, semnătura, fereastra temporală, audiența și action_digest.</w:t>
+        <w:t>Verificatorul controlează cheia, semnătura, fereastra temporală, audiența, execution_proof_digest, field_root și action_digest.</w:t>
       </w:r>
     </w:p>
     <w:p ns2:paraId="7EE6B647" ns2:textId="77777777">
@@ -7801,7 +7800,7 @@
                 <w:rFonts w:eastAsia="Calibri"/>
                 <w:sz w:val="15"/>
               </w:rPr>
-              <w:t>V1 + permis + execuție</w:t>
+              <w:t>pypdf + OCR + dovadă + permis + execuție</w:t>
             </w:r>
           </w:p>
         </w:tc>
@@ -8083,7 +8082,7 @@
                 <w:rFonts w:eastAsia="Calibri"/>
                 <w:sz w:val="15"/>
               </w:rPr>
-              <w:t>Consens pe câmp critic</w:t>
+              <w:t>Divergență structură PDF / pagină vizibilă</w:t>
             </w:r>
           </w:p>
         </w:tc>
@@ -9156,7 +9155,7 @@
           <w:color w:val="5F6B7A"/>
           <w:sz w:val="17"/>
         </w:rPr>
-        <w:t>SODIF Gateway — evaluarea cererii față de politica rutei și permisul protejat.</w:t>
+        <w:t>SODIF Gateway — evaluarea cererii față de politica rutei, dovada valorilor și permisul protejat.</w:t>
       </w:r>
     </w:p>
     <w:tbl>
@@ -9334,7 +9333,7 @@
                 <w:rFonts w:eastAsia="Calibri"/>
                 <w:sz w:val="16"/>
               </w:rPr>
-              <w:t>Relația cu documentul și acțiunea aprobată</w:t>
+              <w:t>Dovada fiecărui parametru față de câmpul aprobat</w:t>
             </w:r>
           </w:p>
         </w:tc>
@@ -9428,7 +9427,7 @@
                 <w:rFonts w:eastAsia="Calibri"/>
                 <w:sz w:val="16"/>
               </w:rPr>
-              <w:t>Digestul exact al planului autorizat</w:t>
+              <w:t>Rădăcina valorilor și digestul exact al planului autorizat</w:t>
             </w:r>
           </w:p>
         </w:tc>
@@ -10425,7 +10424,7 @@
                 <w:rFonts w:eastAsia="Calibri"/>
                 <w:sz w:val="15"/>
               </w:rPr>
-              <w:t>Action digest corespunde exact cererii</w:t>
+              <w:t>Dovada câmpurilor și action digest corespund cererii</w:t>
             </w:r>
           </w:p>
         </w:tc>
@@ -10455,7 +10454,7 @@
                 <w:rFonts w:eastAsia="Calibri"/>
                 <w:sz w:val="15"/>
               </w:rPr>
-              <w:t>permit.action_mismatch</w:t>
+              <w:t>permit.action_mismatch / execution_proof_invalid</w:t>
             </w:r>
           </w:p>
         </w:tc>
@@ -10935,7 +10934,7 @@
                 <w:rFonts w:eastAsia="Calibri"/>
                 <w:sz w:val="16"/>
               </w:rPr>
-              <w:t>digest, risc, vederi, consens și permis</w:t>
+              <w:t>digest, provocare, vederi, rădăcină câmpuri, dovadă și permis</w:t>
             </w:r>
           </w:p>
         </w:tc>
@@ -11617,7 +11616,7 @@
                 <w:b/>
                 <w:sz w:val="15"/>
               </w:rPr>
-              <w:t>Semantică</w:t>
+              <w:t>Semantică și legarea execuției</w:t>
             </w:r>
           </w:p>
         </w:tc>
@@ -11647,7 +11646,7 @@
                 <w:rFonts w:eastAsia="Calibri"/>
                 <w:sz w:val="15"/>
               </w:rPr>
-              <w:t>Risc, niveluri, vederi, încercări, consens, cost și motive</w:t>
+              <w:t>Risc, profile, vederi, consens, cost, challenge digest, field root și execution proof</w:t>
             </w:r>
           </w:p>
         </w:tc>
@@ -15539,7 +15538,7 @@
                 <w:rFonts w:eastAsia="Calibri"/>
                 <w:sz w:val="15"/>
               </w:rPr>
-              <w:t>Vederi eterogene și consens pe câmp</w:t>
+              <w:t>pypdf + randări OCR + invariabilitate pe câmp</w:t>
             </w:r>
           </w:p>
         </w:tc>
@@ -15727,7 +15726,7 @@
                 <w:rFonts w:eastAsia="Calibri"/>
                 <w:sz w:val="15"/>
               </w:rPr>
-              <w:t>AI ca sursă de dovadă + reguli tipizate</w:t>
+              <w:t>Extractor suplimentar ca dovadă + reguli tipizate</w:t>
             </w:r>
           </w:p>
         </w:tc>
@@ -17490,7 +17489,7 @@
                 <w:rFonts w:eastAsia="Calibri"/>
                 <w:sz w:val="16"/>
               </w:rPr>
-              <w:t>Pydantic v2, modele imuabile și validatori de consistență</w:t>
+              <w:t>Pydantic v2, contracte versionate și validatori fail-closed</w:t>
             </w:r>
           </w:p>
         </w:tc>
@@ -17682,7 +17681,7 @@
                 <w:rFonts w:eastAsia="Calibri"/>
                 <w:sz w:val="16"/>
               </w:rPr>
-              <w:t>python-docx, JSON, NDJSON și ZIP determinist</w:t>
+              <w:t>pypdf, PyMuPDF, Tesseract, python-docx, JSON, NDJSON și ZIP determinist</w:t>
             </w:r>
           </w:p>
         </w:tc>
@@ -17806,11 +17805,7 @@
               <w:spacing w:after="0" w:line="240" w:lineRule="auto"/>
             </w:pPr>
             <w:r>
-              <w:rPr>
-                <w:rFonts w:eastAsia="Calibri"/>
-                <w:sz w:val="16"/>
-              </w:rPr>
-              <w:t>157 teste trecute; acoperire 91,50%; prag obligatoriu 85%</w:t>
+              <w:t>162 teste trecute; acoperire 90,94%; prag obligatoriu 85%</w:t>
             </w:r>
           </w:p>
         </w:tc>
@@ -17874,7 +17869,7 @@
                 <w:rFonts w:eastAsia="Calibri"/>
                 <w:sz w:val="16"/>
               </w:rPr>
-              <w:t>0.20.0 / release 0.20.0</w:t>
+              <w:t>0.21.0 / release 0.21.0</w:t>
             </w:r>
           </w:p>
         </w:tc>
@@ -18933,7 +18928,7 @@
           <w:color w:val="0B1F3A"/>
           <w:sz w:val="20"/>
         </w:rPr>
-        <w:t>Sunt implementate și validate automat: SODIF Security, SODIF Archive, SODIF Gateway, cele două Flight-uri, configurarea pe sesiune, exporturile și registrul anti-tamper.</w:t>
+        <w:t>Sunt implementate și validate automat: extragerea PDF structurală și OCR, dovada de invariabilitate legată de execuție, cele trei module, cele două Flight-uri, configurarea pe sesiune, exporturile și registrul anti-tamper.</w:t>
       </w:r>
     </w:p>
     <w:tbl>
@@ -19396,7 +19391,7 @@
                 <w:rFonts w:eastAsia="Calibri"/>
                 <w:sz w:val="15"/>
               </w:rPr>
-              <w:t>V1→V2, 3 views, cost 6/6</w:t>
+              <w:t>V1→V2, 3 căi reale, cost 7/7</w:t>
             </w:r>
           </w:p>
         </w:tc>
@@ -19644,7 +19639,7 @@
                 <w:rFonts w:eastAsia="Calibri"/>
                 <w:sz w:val="15"/>
               </w:rPr>
-              <w:t>semantic-conflict, fără permis</w:t>
+              <w:t>PDF vizibil 1250 / structură 9250, semantic-conflict, fără permis</w:t>
             </w:r>
           </w:p>
         </w:tc>
@@ -19768,7 +19763,7 @@
                 <w:rFonts w:eastAsia="Calibri"/>
                 <w:sz w:val="15"/>
               </w:rPr>
-              <w:t>permit.action_mismatch</w:t>
+              <w:t>permit.action_mismatch / execution_proof_invalid</w:t>
             </w:r>
           </w:p>
         </w:tc>
@@ -20048,6 +20043,491 @@
       </w:tr>
     </w:tbl>
     <w:p ns2:paraId="6E12833B" ns2:textId="77777777"/>
+    <w:p>
+      <w:r>
+        <w:br w:type="page"/>
+      </w:r>
+    </w:p>
+    <w:p>
+      <w:pPr>
+        <w:pStyle w:val="Subtitle"/>
+      </w:pPr>
+      <w:r>
+        <w:t>SECURITATEA LEGĂTURII DOCUMENT API</w:t>
+      </w:r>
+    </w:p>
+    <w:p>
+      <w:pPr>
+        <w:pStyle w:val="Heading1"/>
+        <w:keepNext/>
+      </w:pPr>
+      <w:r>
+        <w:t>Dovada de invariabilitate semantică legată de execuție</w:t>
+      </w:r>
+    </w:p>
+    <w:p>
+      <w:r>
+        <w:t>Mecanismul verifică faptul că valorile aprobate și vizibile în revizia semnată rămân neschimbate până la cererea API. Selecția profilurilor are loc după validarea semnăturii, iar fiecare parametru executabil este acoperit de proveniență și de un angajament criptografic al câmpului.</w:t>
+      </w:r>
+    </w:p>
+    <w:tbl>
+      <w:tblPr>
+        <w:tblStyle w:val="TableGrid"/>
+        <w:tblW w:type="auto" w:w="0"/>
+        <w:tblLook w:firstColumn="1" w:firstRow="1" w:lastColumn="0" w:lastRow="0" w:noHBand="0" w:noVBand="1" w:val="04A0"/>
+      </w:tblPr>
+      <w:tblGrid>
+        <w:gridCol w:w="3120"/>
+        <w:gridCol w:w="3120"/>
+        <w:gridCol w:w="3120"/>
+      </w:tblGrid>
+      <w:tr>
+        <w:tc>
+          <w:tcPr>
+            <w:tcW w:type="dxa" w:w="3120"/>
+            <w:shd w:fill="163A5F"/>
+            <w:vAlign w:val="center"/>
+          </w:tcPr>
+          <w:p>
+            <w:r>
+              <w:rPr>
+                <w:b/>
+                <w:color w:val="FFFFFF"/>
+                <w:sz w:val="18"/>
+              </w:rPr>
+              <w:t>Control</w:t>
+            </w:r>
+          </w:p>
+        </w:tc>
+        <w:tc>
+          <w:tcPr>
+            <w:tcW w:type="dxa" w:w="3120"/>
+            <w:shd w:fill="163A5F"/>
+            <w:vAlign w:val="center"/>
+          </w:tcPr>
+          <w:p>
+            <w:r>
+              <w:rPr>
+                <w:b/>
+                <w:color w:val="FFFFFF"/>
+                <w:sz w:val="18"/>
+              </w:rPr>
+              <w:t>Implementare</w:t>
+            </w:r>
+          </w:p>
+        </w:tc>
+        <w:tc>
+          <w:tcPr>
+            <w:tcW w:type="dxa" w:w="3120"/>
+            <w:shd w:fill="163A5F"/>
+            <w:vAlign w:val="center"/>
+          </w:tcPr>
+          <w:p>
+            <w:r>
+              <w:rPr>
+                <w:b/>
+                <w:color w:val="FFFFFF"/>
+                <w:sz w:val="18"/>
+              </w:rPr>
+              <w:t>Dovadă rezultată</w:t>
+            </w:r>
+          </w:p>
+        </w:tc>
+      </w:tr>
+      <w:tr>
+        <w:tc>
+          <w:tcPr>
+            <w:tcW w:type="dxa" w:w="3120"/>
+            <w:vAlign w:val="center"/>
+          </w:tcPr>
+          <w:p>
+            <w:pPr>
+              <w:spacing w:after="40"/>
+            </w:pPr>
+            <w:r>
+              <w:rPr>
+                <w:sz w:val="18"/>
+              </w:rPr>
+              <w:t>Provocare post-semnătură</w:t>
+            </w:r>
+          </w:p>
+        </w:tc>
+        <w:tc>
+          <w:tcPr>
+            <w:tcW w:type="dxa" w:w="3120"/>
+            <w:vAlign w:val="center"/>
+          </w:tcPr>
+          <w:p>
+            <w:pPr>
+              <w:spacing w:after="40"/>
+            </w:pPr>
+            <w:r>
+              <w:rPr>
+                <w:sz w:val="18"/>
+              </w:rPr>
+              <w:t>Revizie + politică + dovezi ale semnăturii + nonce server</w:t>
+            </w:r>
+          </w:p>
+        </w:tc>
+        <w:tc>
+          <w:tcPr>
+            <w:tcW w:type="dxa" w:w="3120"/>
+            <w:vAlign w:val="center"/>
+          </w:tcPr>
+          <w:p>
+            <w:pPr>
+              <w:spacing w:after="40"/>
+            </w:pPr>
+            <w:r>
+              <w:rPr>
+                <w:sz w:val="18"/>
+              </w:rPr>
+              <w:t>Selectează ordinea profilurilor și produce challenge_digest</w:t>
+            </w:r>
+          </w:p>
+        </w:tc>
+      </w:tr>
+      <w:tr>
+        <w:tc>
+          <w:tcPr>
+            <w:tcW w:type="dxa" w:w="3120"/>
+            <w:vAlign w:val="center"/>
+            <w:shd w:fill="EDF3F8"/>
+          </w:tcPr>
+          <w:p>
+            <w:pPr>
+              <w:spacing w:after="40"/>
+            </w:pPr>
+            <w:r>
+              <w:rPr>
+                <w:sz w:val="18"/>
+              </w:rPr>
+              <w:t>Cale structurală</w:t>
+            </w:r>
+          </w:p>
+        </w:tc>
+        <w:tc>
+          <w:tcPr>
+            <w:tcW w:type="dxa" w:w="3120"/>
+            <w:vAlign w:val="center"/>
+            <w:shd w:fill="EDF3F8"/>
+          </w:tcPr>
+          <w:p>
+            <w:pPr>
+              <w:spacing w:after="40"/>
+            </w:pPr>
+            <w:r>
+              <w:rPr>
+                <w:sz w:val="18"/>
+              </w:rPr>
+              <w:t>pypdf asupra textului și obiectelor interne</w:t>
+            </w:r>
+          </w:p>
+        </w:tc>
+        <w:tc>
+          <w:tcPr>
+            <w:tcW w:type="dxa" w:w="3120"/>
+            <w:vAlign w:val="center"/>
+            <w:shd w:fill="EDF3F8"/>
+          </w:tcPr>
+          <w:p>
+            <w:pPr>
+              <w:spacing w:after="40"/>
+            </w:pPr>
+            <w:r>
+              <w:rPr>
+                <w:sz w:val="18"/>
+              </w:rPr>
+              <w:t>Valori tipizate, pagină, locator și digest de proveniență</w:t>
+            </w:r>
+          </w:p>
+        </w:tc>
+      </w:tr>
+      <w:tr>
+        <w:tc>
+          <w:tcPr>
+            <w:tcW w:type="dxa" w:w="3120"/>
+            <w:vAlign w:val="center"/>
+          </w:tcPr>
+          <w:p>
+            <w:pPr>
+              <w:spacing w:after="40"/>
+            </w:pPr>
+            <w:r>
+              <w:rPr>
+                <w:sz w:val="18"/>
+              </w:rPr>
+              <w:t>Cale vizuală primară</w:t>
+            </w:r>
+          </w:p>
+        </w:tc>
+        <w:tc>
+          <w:tcPr>
+            <w:tcW w:type="dxa" w:w="3120"/>
+            <w:vAlign w:val="center"/>
+          </w:tcPr>
+          <w:p>
+            <w:pPr>
+              <w:spacing w:after="40"/>
+            </w:pPr>
+            <w:r>
+              <w:rPr>
+                <w:sz w:val="18"/>
+              </w:rPr>
+              <w:t>MuPDF 300 DPI + Tesseract ron+eng PSM 6</w:t>
+            </w:r>
+          </w:p>
+        </w:tc>
+        <w:tc>
+          <w:tcPr>
+            <w:tcW w:type="dxa" w:w="3120"/>
+            <w:vAlign w:val="center"/>
+          </w:tcPr>
+          <w:p>
+            <w:pPr>
+              <w:spacing w:after="40"/>
+            </w:pPr>
+            <w:r>
+              <w:rPr>
+                <w:sz w:val="18"/>
+              </w:rPr>
+              <w:t>Valori observabile din pagina randată</w:t>
+            </w:r>
+          </w:p>
+        </w:tc>
+      </w:tr>
+      <w:tr>
+        <w:tc>
+          <w:tcPr>
+            <w:tcW w:type="dxa" w:w="3120"/>
+            <w:vAlign w:val="center"/>
+            <w:shd w:fill="EDF3F8"/>
+          </w:tcPr>
+          <w:p>
+            <w:pPr>
+              <w:spacing w:after="40"/>
+            </w:pPr>
+            <w:r>
+              <w:rPr>
+                <w:sz w:val="18"/>
+              </w:rPr>
+              <w:t>Cale vizuală secundară</w:t>
+            </w:r>
+          </w:p>
+        </w:tc>
+        <w:tc>
+          <w:tcPr>
+            <w:tcW w:type="dxa" w:w="3120"/>
+            <w:vAlign w:val="center"/>
+            <w:shd w:fill="EDF3F8"/>
+          </w:tcPr>
+          <w:p>
+            <w:pPr>
+              <w:spacing w:after="40"/>
+            </w:pPr>
+            <w:r>
+              <w:rPr>
+                <w:sz w:val="18"/>
+              </w:rPr>
+              <w:t>Poppler 360 DPI + Tesseract ron+eng PSM 11</w:t>
+            </w:r>
+          </w:p>
+        </w:tc>
+        <w:tc>
+          <w:tcPr>
+            <w:tcW w:type="dxa" w:w="3120"/>
+            <w:vAlign w:val="center"/>
+            <w:shd w:fill="EDF3F8"/>
+          </w:tcPr>
+          <w:p>
+            <w:pPr>
+              <w:spacing w:after="40"/>
+            </w:pPr>
+            <w:r>
+              <w:rPr>
+                <w:sz w:val="18"/>
+              </w:rPr>
+              <w:t>Confirmare independentă activată adaptiv</w:t>
+            </w:r>
+          </w:p>
+        </w:tc>
+      </w:tr>
+      <w:tr>
+        <w:tc>
+          <w:tcPr>
+            <w:tcW w:type="dxa" w:w="3120"/>
+            <w:vAlign w:val="center"/>
+          </w:tcPr>
+          <w:p>
+            <w:pPr>
+              <w:spacing w:after="40"/>
+            </w:pPr>
+            <w:r>
+              <w:rPr>
+                <w:sz w:val="18"/>
+              </w:rPr>
+              <w:t>Angajamente pe câmp</w:t>
+            </w:r>
+          </w:p>
+        </w:tc>
+        <w:tc>
+          <w:tcPr>
+            <w:tcW w:type="dxa" w:w="3120"/>
+            <w:vAlign w:val="center"/>
+          </w:tcPr>
+          <w:p>
+            <w:pPr>
+              <w:spacing w:after="40"/>
+            </w:pPr>
+            <w:r>
+              <w:rPr>
+                <w:sz w:val="18"/>
+              </w:rPr>
+              <w:t>SHA-256 peste nume, tip, valoare, criticitate și proveniență</w:t>
+            </w:r>
+          </w:p>
+        </w:tc>
+        <w:tc>
+          <w:tcPr>
+            <w:tcW w:type="dxa" w:w="3120"/>
+            <w:vAlign w:val="center"/>
+          </w:tcPr>
+          <w:p>
+            <w:pPr>
+              <w:spacing w:after="40"/>
+            </w:pPr>
+            <w:r>
+              <w:rPr>
+                <w:sz w:val="18"/>
+              </w:rPr>
+              <w:t>Rădăcină Merkle a setului de valori aprobate</w:t>
+            </w:r>
+          </w:p>
+        </w:tc>
+      </w:tr>
+      <w:tr>
+        <w:tc>
+          <w:tcPr>
+            <w:tcW w:type="dxa" w:w="3120"/>
+            <w:vAlign w:val="center"/>
+            <w:shd w:fill="EDF3F8"/>
+          </w:tcPr>
+          <w:p>
+            <w:pPr>
+              <w:spacing w:after="40"/>
+            </w:pPr>
+            <w:r>
+              <w:rPr>
+                <w:sz w:val="18"/>
+              </w:rPr>
+              <w:t>Legare de execuție</w:t>
+            </w:r>
+          </w:p>
+        </w:tc>
+        <w:tc>
+          <w:tcPr>
+            <w:tcW w:type="dxa" w:w="3120"/>
+            <w:vAlign w:val="center"/>
+            <w:shd w:fill="EDF3F8"/>
+          </w:tcPr>
+          <w:p>
+            <w:pPr>
+              <w:spacing w:after="40"/>
+            </w:pPr>
+            <w:r>
+              <w:rPr>
+                <w:sz w:val="18"/>
+              </w:rPr>
+              <w:t>Parametru + locație + valoare canonică + leaf digest</w:t>
+            </w:r>
+          </w:p>
+        </w:tc>
+        <w:tc>
+          <w:tcPr>
+            <w:tcW w:type="dxa" w:w="3120"/>
+            <w:vAlign w:val="center"/>
+            <w:shd w:fill="EDF3F8"/>
+          </w:tcPr>
+          <w:p>
+            <w:pPr>
+              <w:spacing w:after="40"/>
+            </w:pPr>
+            <w:r>
+              <w:rPr>
+                <w:sz w:val="18"/>
+              </w:rPr>
+              <w:t>Binding root și acoperire integrală a requestului</w:t>
+            </w:r>
+          </w:p>
+        </w:tc>
+      </w:tr>
+      <w:tr>
+        <w:tc>
+          <w:tcPr>
+            <w:tcW w:type="dxa" w:w="3120"/>
+            <w:vAlign w:val="center"/>
+          </w:tcPr>
+          <w:p>
+            <w:pPr>
+              <w:spacing w:after="40"/>
+            </w:pPr>
+            <w:r>
+              <w:rPr>
+                <w:sz w:val="18"/>
+              </w:rPr>
+              <w:t>Enforcement</w:t>
+            </w:r>
+          </w:p>
+        </w:tc>
+        <w:tc>
+          <w:tcPr>
+            <w:tcW w:type="dxa" w:w="3120"/>
+            <w:vAlign w:val="center"/>
+          </w:tcPr>
+          <w:p>
+            <w:pPr>
+              <w:spacing w:after="40"/>
+            </w:pPr>
+            <w:r>
+              <w:rPr>
+                <w:sz w:val="18"/>
+              </w:rPr>
+              <w:t>Permis Ed25519 v2 + verificare în SODIF Gateway</w:t>
+            </w:r>
+          </w:p>
+        </w:tc>
+        <w:tc>
+          <w:tcPr>
+            <w:tcW w:type="dxa" w:w="3120"/>
+            <w:vAlign w:val="center"/>
+          </w:tcPr>
+          <w:p>
+            <w:pPr>
+              <w:spacing w:after="40"/>
+            </w:pPr>
+            <w:r>
+              <w:rPr>
+                <w:sz w:val="18"/>
+              </w:rPr>
+              <w:t>Rutare unică sau blocare înaintea serviciului protejat</w:t>
+            </w:r>
+          </w:p>
+        </w:tc>
+      </w:tr>
+    </w:tbl>
+    <w:p>
+      <w:pPr>
+        <w:pStyle w:val="Heading2"/>
+      </w:pPr>
+      <w:r>
+        <w:t>Caz demonstrat prin procesare reală</w:t>
+      </w:r>
+    </w:p>
+    <w:p>
+      <w:r>
+        <w:t>Scenariul de conflict folosește un PDF valid care afișează totalul 1250.00, dar conține în stratul structural invizibil valoarea 9250.00. pypdf extrage valoarea internă, iar ambele randări OCR citesc valoarea vizibilă. Divergența câmpului critic oprește dovada, permisul și apelul API.</w:t>
+      </w:r>
+    </w:p>
     <w:sectPr>
       <w:pgSz w:w="12240" w:h="15840"/>
       <w:pgMar w:top="1440" w:right="1440" w:bottom="1440" w:left="1440" w:header="708" w:footer="708" w:gutter="0"/>

</xml_diff>